<commit_message>
Post-process v4 manuscripts: Vancouver citations, figure renumbering, English polish
- Convert all citations from Harvard (author-date) to Vancouver numbered style
  with Word-native font superscript (run.font.superscript = True)
- Renumber figures 1-12 and tables 1-5 in order of first appearance in text
- Reorder reference list (26 refs) to match Vancouver citation order
- Polish English in new sections to reduce AI-sounding language
- Move parliamentary democracies paragraph from Sample size to Limitations
- Move era discussion paragraph before Saleh comparison (logical flow fix)
- Add missing Burnham & Anderson (2002) to JA reference list
- Add inline Davies (2005) citation for Zamoyski maxim (was orphan)
- Remove editorial annotation from Davies reference
- Fix n_total variable scope bug in EN generation script
- Fix JA disfavoured polities list to be dynamically generated (includes Byzantine)

Co-Authored-By: Tatsuki Onishi <bougtoir@gmail.com>
</commit_message>
<xml_diff>
--- a/manuscript/hassc_manuscript_ja_v4.docx
+++ b/manuscript/hassc_manuscript_ja_v4.docx
@@ -71,11 +71,22 @@
     <w:p>
       <w:r>
         <w:rPr>
-          <w:b w:val="0"/>
-          <w:i w:val="0"/>
           <w:sz w:val="24"/>
         </w:rPr>
-        <w:t>ワイブル分布は、機械部品や電子機器の故障時間をモデル化する信頼性工学の基幹ツールであり、近年Saleh（2019）によるローマ皇帝の画期的研究を通じて政治史に応用された。本研究はこのアプローチをグローバル規模に拡張し、6大陸・3,000年以上の歴史にわたる31の政体における統治者在位期間にワイブル分布を当てはめた。ワイブル形状パラメータkは定量的な「政治安定性指標」として機能する：k &lt; 1はハザード減少（クーデター多発型）、k ≈ 1は一定ハザード（無記憶・ランダム交代）、k &gt; 1はハザード増加（安定的・老化型パターン）を示す。主解析では政体間に大きなばらつきが認められた（k範囲：0.851-2.721、中央値1.240）。継承メカニズム別のサブ解析では、選挙制（プールk = 1.019）が世襲制（プールk = 1.298）より有意に低い安定性を示した（二標本KS検定 p &lt; 0.0001）。年代別サブ解析では、古代（k = 0.890）から近代（k = 1.200）にかけてkの単調増加が認められ、現代（k = 0.996）で反転が見られた。これらの知見はワイブル形状パラメータが歴史的政治安定性の頑健かつ文化横断的な指標であることを示している。</w:t>
+        <w:t>ワイブル分布は、機械部品や電子機器の故障時間をモデル化する信頼性工学の基幹ツールであり、近年Saleh</w:t>
+      </w:r>
+      <w:r>
+        <w:rPr>
+          <w:sz w:val="24"/>
+          <w:vertAlign w:val="superscript"/>
+        </w:rPr>
+        <w:t>1</w:t>
+      </w:r>
+      <w:r>
+        <w:rPr>
+          <w:sz w:val="24"/>
+        </w:rPr>
+        <w:t>によるローマ皇帝の画期的研究を通じて政治史に応用された。本研究はこのアプローチをグローバル規模に拡張し、6大陸・3,000年以上の歴史にわたる31の政体における統治者在位期間にワイブル分布を当てはめた。ワイブル形状パラメータkは定量的な「政治安定性指標」として機能する：k &lt; 1はハザード減少（クーデター多発型）、k ≈ 1は一定ハザード（無記憶・ランダム交代）、k &gt; 1はハザード増加（安定的・老化型パターン）を示す。主解析では政体間に大きなばらつきが認められた（k範囲：0.851-2.721、中央値1.240）。継承メカニズム別のサブ解析では、選挙制（プールk = 1.019）が世襲制（プールk = 1.298）より有意に低い安定性を示した（二標本KS検定 p &lt; 0.0001）。年代別サブ解析では、古代（k = 0.890）から近代（k = 1.200）にかけてkの単調増加が認められ、現代（k = 0.996）で反転が見られた。これらの知見はワイブル形状パラメータが歴史的政治安定性の頑健かつ文化横断的な指標であることを示している。</w:t>
       </w:r>
     </w:p>
     <w:p>
@@ -112,41 +123,163 @@
     <w:p>
       <w:r>
         <w:rPr>
-          <w:b w:val="0"/>
-          <w:i w:val="0"/>
           <w:sz w:val="24"/>
         </w:rPr>
-        <w:t>信頼性工学の手法を歴史的・社会的現象に応用することは、定量的歴史学の新たなフロンティアである。信頼性工学は主に機械部品・電子デバイス・複雑システムの故障時間を分析するために発展し、時間-イベントデータを理解するための数学的に厳密な枠組みを提供する（Lawless, 2003）。この枠組みの中心に位置するのが、1951年にWaloddi Weibullによって導入されたワイブル分布であり、工学における故障時間分布のモデリングの標準ツールとなっている（Weibull, 1951; Abernethy, 2004）。この分布の汎用性は形状パラメータkに由来する：k &lt; 1は初期故障（時間とともに減少する早期故障）、k = 1はランダム故障（指数分布と等価な一定ハザード）、k &gt; 1は摩耗故障（年齢とともに増加するハザード）に対応する。これら三つの体制は信頼性工学でよく知られた「バスタブ曲線」を構成する（O'Connor and Kleyner, 2012）。</w:t>
+        <w:t>信頼性工学の手法を歴史的・社会的現象に応用することは、定量的歴史学の新たなフロンティアである。信頼性工学は主に機械部品・電子デバイス・複雑システムの故障時間を分析するために発展し、時間-イベントデータを理解するための数学的に厳密な枠組みを提供する</w:t>
+      </w:r>
+      <w:r>
+        <w:rPr>
+          <w:sz w:val="24"/>
+          <w:vertAlign w:val="superscript"/>
+        </w:rPr>
+        <w:t>2</w:t>
+      </w:r>
+      <w:r>
+        <w:rPr>
+          <w:sz w:val="24"/>
+        </w:rPr>
+        <w:t>。この枠組みの中心に位置するのが、1951年にWaloddi Weibullによって導入されたワイブル分布であり、工学における故障時間分布のモデリングの標準ツールとなっている</w:t>
+      </w:r>
+      <w:r>
+        <w:rPr>
+          <w:sz w:val="24"/>
+          <w:vertAlign w:val="superscript"/>
+        </w:rPr>
+        <w:t>3,4</w:t>
+      </w:r>
+      <w:r>
+        <w:rPr>
+          <w:sz w:val="24"/>
+        </w:rPr>
+        <w:t>。この分布の汎用性は形状パラメータkに由来する：k &lt; 1は初期故障（時間とともに減少する早期故障）、k = 1はランダム故障（指数分布と等価な一定ハザード）、k &gt; 1は摩耗故障（年齢とともに増加するハザード）に対応する。これら三つの体制は信頼性工学でよく知られた「バスタブ曲線」を構成する</w:t>
+      </w:r>
+      <w:r>
+        <w:rPr>
+          <w:sz w:val="24"/>
+          <w:vertAlign w:val="superscript"/>
+        </w:rPr>
+        <w:t>5</w:t>
+      </w:r>
+      <w:r>
+        <w:rPr>
+          <w:sz w:val="24"/>
+        </w:rPr>
+        <w:t>。</w:t>
       </w:r>
     </w:p>
     <w:p>
       <w:r>
         <w:rPr>
-          <w:b w:val="0"/>
-          <w:i w:val="0"/>
           <w:sz w:val="24"/>
         </w:rPr>
-        <w:t>機械的故障から政治的継承への概念的飛躍を先駆けたのがSaleh（2019）であり、69人のローマ皇帝の在位期間にワイブル分布を当てはめた。Salehはローマ帝国の在位期間分布がk = 0.93のワイブル分布に従うことを示し、ハザード率がわずかに減少するパターン——暴力的除去のリスクが統治初期に最も高い「クーデター多発型」体制と整合的なパターン——を明らかにした。</w:t>
+        <w:t>機械的故障から政治的継承への概念的飛躍を先駆けたのがSaleh</w:t>
+      </w:r>
+      <w:r>
+        <w:rPr>
+          <w:sz w:val="24"/>
+          <w:vertAlign w:val="superscript"/>
+        </w:rPr>
+        <w:t>1</w:t>
+      </w:r>
+      <w:r>
+        <w:rPr>
+          <w:sz w:val="24"/>
+        </w:rPr>
+        <w:t>であり、69人のローマ皇帝の在位期間にワイブル分布を当てはめた。Salehはローマ帝国の在位期間分布がk = 0.93のワイブル分布に従うことを示し、ハザード率がわずかに減少するパターン——暴力的除去のリスクが統治初期に最も高い「クーデター多発型」体制と整合的なパターン——を明らかにした。</w:t>
       </w:r>
     </w:p>
     <w:p>
       <w:r>
         <w:rPr>
-          <w:b w:val="0"/>
-          <w:i w:val="0"/>
           <w:sz w:val="24"/>
         </w:rPr>
-        <w:t>統治者の在位期間を部品の寿命と類推的に扱う理論的正当性は、憲法理論に予期せぬ支持を見出す。天皇機関説は、日本の著名な憲法学者・美濃部達吉が20世紀初頭に提唱したもので、天皇を超越的主権者ではなく国家の機関（きかん）として明示的に概念化した（美濃部, 1912, 1923）。この枠組みの下では、君主は統治の大きな機構の中で一つの構成要素として機能する——個々の構成要素が複雑システムの中で定められた役割を果たすという信頼性工学の観点と直接的に並行する概念化である。美濃部の理論は日本の憲法的文脈で発展し、1935年の天皇機関説事件で物議を醸しつつ弾圧されたが、その核心的洞察——統治者は固有の存在ではなく国家装置の機能的要素である——は、政治的継承に工学的故障モデルを適用する原理的根拠を提供する（Miller, 1965; Banno, 2001）。</w:t>
+        <w:t>統治者の在位期間を部品の寿命と類推的に扱う理論的正当性は、憲法理論に予期せぬ支持を見出す。天皇機関説は、日本の著名な憲法学者・美濃部達吉が20世紀初頭に提唱したもので、天皇を超越的主権者ではなく国家の機関（きかん）として明示的に概念化した</w:t>
+      </w:r>
+      <w:r>
+        <w:rPr>
+          <w:sz w:val="24"/>
+          <w:vertAlign w:val="superscript"/>
+        </w:rPr>
+        <w:t>6,7</w:t>
+      </w:r>
+      <w:r>
+        <w:rPr>
+          <w:sz w:val="24"/>
+        </w:rPr>
+        <w:t>。この枠組みの下では、君主は統治の大きな機構の中で一つの構成要素として機能する——個々の構成要素が複雑システムの中で定められた役割を果たすという信頼性工学の観点と直接的に並行する概念化である。美濃部の理論は日本の憲法的文脈で発展し、1935年の天皇機関説事件で物議を醸しつつ弾圧されたが、その核心的洞察——統治者は固有の存在ではなく国家装置の機能的要素である——は、政治的継承に工学的故障モデルを適用する原理的根拠を提供する</w:t>
+      </w:r>
+      <w:r>
+        <w:rPr>
+          <w:sz w:val="24"/>
+          <w:vertAlign w:val="superscript"/>
+        </w:rPr>
+        <w:t>8,9</w:t>
+      </w:r>
+      <w:r>
+        <w:rPr>
+          <w:sz w:val="24"/>
+        </w:rPr>
+        <w:t>。</w:t>
       </w:r>
     </w:p>
     <w:p>
       <w:r>
         <w:rPr>
-          <w:b w:val="0"/>
-          <w:i w:val="0"/>
           <w:sz w:val="24"/>
         </w:rPr>
-        <w:t>Salehのアプローチの将来性にもかかわらず、既存の文献は単一の政体に限定されている。ワイブル分布がローマ帝国を超えて一般化できるか、また形状パラメータkが意味のある文化横断的な政治安定性指標として機能するかは未解決の問題である。政治的ダイナミクスに対する先行の定量的アプローチは、帝国の成長と衰退（Taagepera, 1979）、国家形成の長期的循環（Turchin, 2003; Turchin and Nefedov, 2009）、紛争の重大性におけるべき乗則（Clauset, 2018）、政治組織の文化横断的変異（Murdock, 1967; Olsson and Paik, 2016）を検討してきたが、統治者の在位期間にパラメトリック生存分析を体系的な政治安定性指標として適用したものはない。本研究はこのギャップに取り組み、ヨーロッパ、アジア、中東、アフリカ、アメリカにわたる31の政体の統治者在位期間に対して系統的なワイブル分析を実施し、3千年以上にわたる1,000件以上の個別の在位期間を包含する。さらに、継承メカニズム別（選挙制 vs 世襲制）および歴史的年代別（古代、中世、近世、近代、現代）の層別サブ解析を行い、政治安定性の構造的・時間的決定因子を探究する。</w:t>
+        <w:t>Salehのアプローチの将来性にもかかわらず、既存の文献は単一の政体に限定されている。ワイブル分布がローマ帝国を超えて一般化できるか、また形状パラメータkが意味のある文化横断的な政治安定性指標として機能するかは未解決の問題である。政治的ダイナミクスに対する先行の定量的アプローチは、帝国の成長と衰退</w:t>
+      </w:r>
+      <w:r>
+        <w:rPr>
+          <w:sz w:val="24"/>
+          <w:vertAlign w:val="superscript"/>
+        </w:rPr>
+        <w:t>10</w:t>
+      </w:r>
+      <w:r>
+        <w:rPr>
+          <w:sz w:val="24"/>
+        </w:rPr>
+        <w:t>、国家形成の長期的循環</w:t>
+      </w:r>
+      <w:r>
+        <w:rPr>
+          <w:sz w:val="24"/>
+          <w:vertAlign w:val="superscript"/>
+        </w:rPr>
+        <w:t>11,12</w:t>
+      </w:r>
+      <w:r>
+        <w:rPr>
+          <w:sz w:val="24"/>
+        </w:rPr>
+        <w:t>、紛争の重大性におけるべき乗則</w:t>
+      </w:r>
+      <w:r>
+        <w:rPr>
+          <w:sz w:val="24"/>
+          <w:vertAlign w:val="superscript"/>
+        </w:rPr>
+        <w:t>13</w:t>
+      </w:r>
+      <w:r>
+        <w:rPr>
+          <w:sz w:val="24"/>
+        </w:rPr>
+        <w:t>、政治組織の文化横断的変異</w:t>
+      </w:r>
+      <w:r>
+        <w:rPr>
+          <w:sz w:val="24"/>
+          <w:vertAlign w:val="superscript"/>
+        </w:rPr>
+        <w:t>14,15</w:t>
+      </w:r>
+      <w:r>
+        <w:rPr>
+          <w:sz w:val="24"/>
+        </w:rPr>
+        <w:t>を検討してきたが、統治者の在位期間にパラメトリック生存分析を体系的な政治安定性指標として適用したものはない。本研究はこのギャップに取り組み、ヨーロッパ、アジア、中東、アフリカ、アメリカにわたる31の政体の統治者在位期間に対して系統的なワイブル分析を実施し、3千年以上にわたる1,000件以上の個別の在位期間を包含する。さらに、継承メカニズム別（選挙制 vs 世襲制）および歴史的年代別（古代、中世、近世、近代、現代）の層別サブ解析を行い、政治安定性の構造的・時間的決定因子を探究する。</w:t>
       </w:r>
     </w:p>
     <w:p>
@@ -278,7 +411,20 @@
         <w:rPr>
           <w:sz w:val="22"/>
         </w:rPr>
-        <w:t>ワイブル分布が単に許容可能な当てはまりを提供するだけでなく、最良の当てはまりを提供するかを評価するため、正の右裾データに対する4つの候補分布（ワイブル、対数正規、ガンマ、指数）の体系的なモデル選択を実施した。すべての分布は位置パラメータをゼロに固定してMLEで当てはめた。モデル比較には赤池情報量規準（AIC）およびベイズ情報量規準（BIC）を用いた。ΔAIC &lt; 2は本質的に同等の当てはまりを示し、ΔAIC 2-10は中程度の証拠、ΔAIC &gt; 10は強い証拠を示す（Burnham and Anderson, 2002）。指数分布（1パラメータ）は無記憶な継承（k = 1）に対応するネスト帰無モデルとして機能する。</w:t>
+        <w:t>ワイブル分布が単に許容可能な当てはまりを提供するだけでなく、最良の当てはまりを提供するかを評価するため、正の右裾データに対する4つの候補分布（ワイブル、対数正規、ガンマ、指数）の体系的なモデル選択を実施した。すべての分布は位置パラメータをゼロに固定してMLEで当てはめた。モデル比較には赤池情報量規準（AIC）およびベイズ情報量規準（BIC）を用いた。ΔAIC &lt; 2は本質的に同等の当てはまりを示し、ΔAIC 2-10は中程度の証拠、ΔAIC &gt; 10は強い証拠を示す</w:t>
+      </w:r>
+      <w:r>
+        <w:rPr>
+          <w:sz w:val="22"/>
+          <w:vertAlign w:val="superscript"/>
+        </w:rPr>
+        <w:t>16</w:t>
+      </w:r>
+      <w:r>
+        <w:rPr>
+          <w:sz w:val="22"/>
+        </w:rPr>
+        <w:t>。指数分布（1パラメータ）は無記憶な継承（k = 1）に対応するネスト帰無モデルとして機能する。</w:t>
       </w:r>
     </w:p>
     <w:p>
@@ -311,11 +457,35 @@
     <w:p>
       <w:r>
         <w:rPr>
-          <w:b w:val="0"/>
-          <w:i w:val="0"/>
           <w:sz w:val="24"/>
         </w:rPr>
-        <w:t>サブグループ間（選挙制 vs 世襲制、年代間）の差は二標本コルモゴロフ・スミルノフ検定およびマン・ホイットニーU検定で評価した。形状パラメータの差に対するブートストラップ検定を1,000回の再標本で実施し、P(k_世襲 &gt; k_選挙)および差の95%信頼区間を算出した。カプラン・マイヤー生存曲線（Kaplan and Meier, 1958）をプール・サブグループの視覚的比較のために算出した。比例ハザードの仮定はCox（1972）の枠組みに従って評価した。全ての分析はPython 3（NumPy、SciPy、Matplotlib）で実施した。</w:t>
+        <w:t>サブグループ間（選挙制 vs 世襲制、年代間）の差は二標本コルモゴロフ・スミルノフ検定およびマン・ホイットニーU検定で評価した。形状パラメータの差に対するブートストラップ検定を1,000回の再標本で実施し、P(k_世襲 &gt; k_選挙)および差の95%信頼区間を算出した。カプラン・マイヤー生存曲線</w:t>
+      </w:r>
+      <w:r>
+        <w:rPr>
+          <w:sz w:val="24"/>
+          <w:vertAlign w:val="superscript"/>
+        </w:rPr>
+        <w:t>17</w:t>
+      </w:r>
+      <w:r>
+        <w:rPr>
+          <w:sz w:val="24"/>
+        </w:rPr>
+        <w:t>をプール・サブグループの視覚的比較のために算出した。比例ハザードの仮定はCox</w:t>
+      </w:r>
+      <w:r>
+        <w:rPr>
+          <w:sz w:val="24"/>
+          <w:vertAlign w:val="superscript"/>
+        </w:rPr>
+        <w:t>18</w:t>
+      </w:r>
+      <w:r>
+        <w:rPr>
+          <w:sz w:val="24"/>
+        </w:rPr>
+        <w:t>の枠組みに従って評価した。全ての分析はPython 3（NumPy、SciPy、Matplotlib）で実施した。</w:t>
       </w:r>
     </w:p>
     <w:p>
@@ -2858,7 +3028,7 @@
         <w:rPr>
           <w:sz w:val="22"/>
         </w:rPr>
-        <w:t>査読者1の提案に従い、1000年以前の教皇庁（N = 140）の補足分析を実施し、主解析に含まれる1000年以降（N = 121）と比較した。1000年以前の教皇庁はk = 1.0923（95% CI [0.9772, 1.2503]）であり、1に近く、近似的に指数的（無記憶的）な継承動態を示唆する。これはコンクラーヴェ以前の教皇選出が在位期間に関して本質的にランダムであったという仮説と一致する。1000年以降の教皇庁（k = 1.1629、95% CI [1.0378, 1.3254]）はわずかに高い形状パラメータを示し、コンクラーヴェ選挙制度の安定化効果と整合的である。二標本コルモゴロフ・スミルノフ検定（p = 0.5629）およびマン・ホイットニーU検定（p = 0.1347）は0.05水準で二期間間に統計的に有意な差がないことを示す。図10に両期間の生存関数、ワイブル確率プロット、在位期間ヒストグラムを示す。</w:t>
+        <w:t>査読者1の提案に従い、1000年以前の教皇庁（N = 140）の補足分析を実施し、主解析に含まれる1000年以降（N = 121）と比較した。1000年以前の教皇庁はk = 1.0923（95% CI [0.9772, 1.2503]）であり、1に近く、近似的に指数的（無記憶的）な継承動態を示唆する。これはコンクラーヴェ以前の教皇選出が在位期間に関して本質的にランダムであったという仮説と一致する。1000年以降の教皇庁（k = 1.1629、95% CI [1.0378, 1.3254]）はわずかに高い形状パラメータを示し、コンクラーヴェ選挙制度の安定化効果と整合的である。二標本コルモゴロフ・スミルノフ検定（p = 0.5629）およびマン・ホイットニーU検定（p = 0.1347）は0.05水準で二期間間に統計的に有意な差がないことを示す。図2に両期間の生存関数、ワイブル確率プロット、在位期間ヒストグラムを示す。</w:t>
       </w:r>
     </w:p>
     <w:p>
@@ -2906,7 +3076,7 @@
           <w:i/>
           <w:sz w:val="22"/>
         </w:rPr>
-        <w:t>図10. 教皇庁：1000年以前 vs 1000年以降の比較。(A) カプラン・マイヤー生存関数とワイブル当てはめ曲線。(B) ワイブル確率プロット。(C) 在位期間ヒストグラムとワイブルPDFの当てはめ。</w:t>
+        <w:t>図2. 教皇庁：1000年以前 vs 1000年以降の比較。(A) カプラン・マイヤー生存関数とワイブル当てはめ曲線。(B) ワイブル確率プロット。(C) 在位期間ヒストグラムとワイブルPDFの当てはめ。</w:t>
       </w:r>
     </w:p>
     <w:p>
@@ -2937,7 +3107,7 @@
           <w:i w:val="0"/>
           <w:sz w:val="24"/>
         </w:rPr>
-        <w:t>平均在位期間も大きく異なった：選挙制11.2年 vs 世襲制18.6年。選挙制のk ≈ 1は、統治者が交代する確率が在位期間に関わらずほぼ一定であることを意味し、任期制限・競争的選挙・宮廷クーデターなど在位期間とは独立に作動する政治的メカニズムと整合的である。一方、世襲制のk &gt; 1は生物学的老化と在位期間の長い君主に蓄積する政治的圧力の影響を反映している。注目すべき外れ値はUSA大統領（k = 2.721）であり、選挙制に分類されるが全政体中最高のkを示し、アメリカ大統領制の高度に規則化された任期構造を反映している。図2にこれらの地理的分布を、図3に選挙制と世襲制の詳細な統計的比較を示す。</w:t>
+        <w:t>平均在位期間も大きく異なった：選挙制11.2年 vs 世襲制18.6年。選挙制のk ≈ 1は、統治者が交代する確率が在位期間に関わらずほぼ一定であることを意味し、任期制限・競争的選挙・宮廷クーデターなど在位期間とは独立に作動する政治的メカニズムと整合的である。一方、世襲制のk &gt; 1は生物学的老化と在位期間の長い君主に蓄積する政治的圧力の影響を反映している。注目すべき外れ値はUSA大統領（k = 2.721）であり、選挙制に分類されるが全政体中最高のkを示し、アメリカ大統領制の高度に規則化された任期構造を反映している。図3にこれらの地理的分布を、図4に選挙制と世襲制の詳細な統計的比較を示す。</w:t>
       </w:r>
     </w:p>
     <w:p>
@@ -2988,7 +3158,7 @@
           <w:i/>
           <w:sz w:val="20"/>
         </w:rPr>
-        <w:t>図2. 選挙制（左）と世襲制（右）政体の世界地図比較。</w:t>
+        <w:t>図3. 選挙制（左）と世襲制（右）政体の世界地図比較。</w:t>
       </w:r>
     </w:p>
     <w:p/>
@@ -3040,7 +3210,7 @@
           <w:i/>
           <w:sz w:val="20"/>
         </w:rPr>
-        <w:t>図3. サブ解析1：選挙制 vs 世襲制の詳細比較。左上：政体別k値。右上：箱ひげ図。左下：プール生存曲線。右下：ハザード関数。</w:t>
+        <w:t>図4. サブ解析1：選挙制 vs 世襲制の詳細比較。左上：政体別k値。右上：箱ひげ図。左下：プール生存曲線。右下：ハザード関数。</w:t>
       </w:r>
     </w:p>
     <w:p/>
@@ -3072,7 +3242,7 @@
           <w:i w:val="0"/>
           <w:sz w:val="24"/>
         </w:rPr>
-        <w:t>古代はローマ帝国（k = 0.880）に支配され、クーデター多発型のハザード減少パターンを示した。中世は最大のサンプル（N = 531、19政体）を有し、ハザード増加の端緒が見られた。近世・近代ではこの傾向が継続し、近世の日本天皇（k = 2.864）や近代のフランス（k = 3.066）など特に高いk値が見られた。現代のk ≈ 1への回帰は小サンプル（N = 27、8政体）に基づくため慎重な解釈が必要であり、近代と現代を統合した感度分析ではk = 1.147（95% CI [1.06, 1.25]）であった。図4に年代別層別分析の結果を、図5に地理的地域、継承メカニズム、歴史的年代のkの箱ひげ図比較を示す。</w:t>
+        <w:t>古代はローマ帝国（k = 0.880）に支配され、クーデター多発型のハザード減少パターンを示した。中世は最大のサンプル（N = 531、19政体）を有し、ハザード増加の端緒が見られた。近世・近代ではこの傾向が継続し、近世の日本天皇（k = 2.864）や近代のフランス（k = 3.066）など特に高いk値が見られた。現代のk ≈ 1への回帰は小サンプル（N = 27、8政体）に基づくため慎重な解釈が必要であり、近代と現代を統合した感度分析ではk = 1.147（95% CI [1.06, 1.25]）であった。図5に年代別層別分析の結果を、図6に地理的地域、継承メカニズム、歴史的年代のkの箱ひげ図比較を示す。</w:t>
       </w:r>
     </w:p>
     <w:p>
@@ -3717,7 +3887,7 @@
           <w:i/>
           <w:sz w:val="20"/>
         </w:rPr>
-        <w:t>図4. サブ解析2：年代別層別分析。上段：タイムライン・バブルチャート。中段左：年代別k値箱ひげ図。中段右：プール生存曲線。下段左：リッジプロット。下段右：ハザード関数。</w:t>
+        <w:t>図5. サブ解析2：年代別層別分析。上段：タイムライン・バブルチャート。中段左：年代別k値箱ひげ図。中段右：プール生存曲線。下段左：リッジプロット。下段右：ハザード関数。</w:t>
       </w:r>
     </w:p>
     <w:p/>
@@ -3769,7 +3939,7 @@
           <w:i/>
           <w:sz w:val="20"/>
         </w:rPr>
-        <w:t>図5. ワイブル形状パラメータkの箱ひげ図比較：地理的地域別（左）、継承メカニズム別（中央）、歴史的年代別（右）。個別政体の値をスキャッタープロットとして重畳。</w:t>
+        <w:t>図6. ワイブル形状パラメータkの箱ひげ図比較：地理的地域別（左）、継承メカニズム別（中央）、歴史的年代別（右）。個別政体の値をスキャッタープロットとして重畳。</w:t>
       </w:r>
     </w:p>
     <w:p/>
@@ -3786,7 +3956,7 @@
         <w:rPr>
           <w:sz w:val="22"/>
         </w:rPr>
-        <w:t>31政体すべてに対してワイブル、対数正規、ガンマ、指数分布の体系的モデル選択を実施した。AICにより、ワイブル分布は12/31政体で最良モデルであり、対数正規が6、ガンマが3、指数が10政体で最良であった。重要なことに、ワイブルは26/31政体でΔAIC &lt; 2以内であり、データセットの大多数で統計的に競争力のある当てはまりを提供することが確認された。ワイブルが明確に劣位となった政体（ΔAIC &gt; 4）は日本天皇（ΔAIC = 17.4、対数正規が優位）およびアメリカ合衆国大統領（ΔAIC = 9.6、対数正規が優位）であった。日本天皇については在位期間の重い右裾（50年を超える天皇が複数存在）が対数正規分布のより重い裾でよく捕捉される。アメリカ合衆国大統領については任期制限による離散的構造が対数正規でより自然に記述される。これらの結果はワイブル分布が文化横断的比較のための妥当な分析的枠組みを提供することを確認しつつ、普遍的に最良の当てはまりモデルではないことを認める。形状パラメータkの解釈上の利点（バスタブ曲線の枠組みを介したハザード動態への直接的対応）は、代替分布がわずかに良い統計的当てはまりを達成する場合でも、主要指標としてのkの使用を正当化する。図9にすべての政体と分布のΔAIC・ΔBIC値を示す。</w:t>
+        <w:t>31政体すべてに対してワイブル、対数正規、ガンマ、指数分布の体系的モデル選択を実施した。AICにより、ワイブル分布は12/31政体で最良モデルであり、対数正規が6、ガンマが3、指数が10政体で最良であった。重要なことに、ワイブルは26/31政体でΔAIC &lt; 2以内であり、データセットの大多数で統計的に競争力のある当てはまりを提供することが確認された。ワイブルが明確に劣位となった政体（ΔAIC &gt; 4）はJapan (Emperors)（ΔAIC = 17.4、Log-normalが優位）、USA (Presidents)（ΔAIC = 9.6、Log-normalが優位）、Byzantine Empire（ΔAIC = 4.6、Log-normalが優位）であった。日本天皇については在位期間の重い右裾（50年を超える天皇が複数存在）が対数正規分布のより重い裾でよく捕捉される。アメリカ合衆国大統領については任期制限による離散的構造が対数正規でより自然に記述される。これらの結果はワイブル分布が文化横断的比較のための妥当な分析的枠組みを提供することを確認しつつ、普遍的に最良の当てはまりモデルではないことを認める。形状パラメータkの解釈上の利点（バスタブ曲線の枠組みを介したハザード動態への直接的対応）は、代替分布がわずかに良い統計的当てはまりを達成する場合でも、主要指標としてのkの使用を正当化する。図7にすべての政体と分布のΔAIC・ΔBIC値を示す。</w:t>
       </w:r>
     </w:p>
     <w:p>
@@ -3834,7 +4004,7 @@
           <w:i/>
           <w:sz w:val="22"/>
         </w:rPr>
-        <w:t>図9. モデル選択比較。各政体について最良モデルに対するΔAIC（左）とΔBIC（右）。塗り潰し丸は最良モデル、白抜き四角は競争的代替モデル（ΔAIC &lt; 2）を示す。</w:t>
+        <w:t>図7. モデル選択比較。各政体について最良モデルに対するΔAIC（左）とΔBIC（右）。塗り潰し丸は最良モデル、白抜き四角は競争的代替モデル（ΔAIC &lt; 2）を示す。</w:t>
       </w:r>
     </w:p>
     <w:p>
@@ -3859,11 +4029,22 @@
     <w:p>
       <w:r>
         <w:rPr>
-          <w:b w:val="0"/>
-          <w:i w:val="0"/>
           <w:sz w:val="24"/>
         </w:rPr>
-        <w:t>ワイブル形状パラメータkの解釈を評価するため、政治指導者のArchigosデータセット（Goemans et al., 2009）を利用可能な範囲で活用し、一次的な歴史資料で補完して、各政体の暴力的継承率（暗殺、クーデター、戦死による王位交代の割合）および主要な内戦の頻度をkと対比した。表3に主要な政体の暴力的継承率を示す。kと暴力的継承率の間にはスピアマン順位相関で有意な負の相関が認められた（rho = -0.638, p = 0.0002）。k &lt; 1の政体群の暴力的継承率平均は59.6%であったのに対し、k &gt; 1.3の政体群では20.5%であった。kと内戦頻度の相関も有意であった（rho = -0.528, p = 0.003）。 ワイブル形状パラメータと暴力的継承率はいずれも同一の歴史的記録から導出されるため（在位期間の境界を決定するイベントが継承の暴力性の分類にも影響する）、この分析は独立した外部検証ではなく内部整合性の実証として位置づけられる。</w:t>
+        <w:t>ワイブル形状パラメータkの解釈を評価するため、政治指導者のArchigosデータセット</w:t>
+      </w:r>
+      <w:r>
+        <w:rPr>
+          <w:sz w:val="24"/>
+          <w:vertAlign w:val="superscript"/>
+        </w:rPr>
+        <w:t>19</w:t>
+      </w:r>
+      <w:r>
+        <w:rPr>
+          <w:sz w:val="24"/>
+        </w:rPr>
+        <w:t>を利用可能な範囲で活用し、一次的な歴史資料で補完して、各政体の暴力的継承率（暗殺、クーデター、戦死による王位交代の割合）および主要な内戦の頻度をkと対比した。表3に主要な政体の暴力的継承率を示す。kと暴力的継承率の間にはスピアマン順位相関で有意な負の相関が認められた（rho = -0.638, p = 0.0002）。k &lt; 1の政体群の暴力的継承率平均は59.6%であったのに対し、k &gt; 1.3の政体群では20.5%であった。kと内戦頻度の相関も有意であった（rho = -0.528, p = 0.003）。 ワイブル形状パラメータと暴力的継承率はいずれも同一の歴史的記録から導出されるため（在位期間の境界を決定するイベントが継承の暴力性の分類にも影響する）、この分析は独立した外部検証ではなく内部整合性の実証として位置づけられる。</w:t>
       </w:r>
     </w:p>
     <w:p>
@@ -3873,7 +4054,7 @@
           <w:i w:val="0"/>
           <w:sz w:val="24"/>
         </w:rPr>
-        <w:t>個別の政体について検証すると、マムルーク朝（k = 0.851）は暴力的継承率63.0%で、軍事奴隷制に特有の不安定な権力移行を反映している。ローマ帝国（k = 0.880）は暴力的継承率56.4%で、3世紀の軍人皇帝時代の慢性的暴力を含む。対照的に、デンマーク（k = 1.788）は暴力的継承率8.7%、スウェーデン（k = 1.897）は13.0%であり、北欧の秩序ある継承伝統と整合的である。注目すべき例外として、スコットランド（k = 1.937だが暴力的継承率30.5%）は、暴力が存在しても時間的に均等に分散している場合にkが高くなりうることを示す。図6にkと暴力的継承率の散布図を示す。</w:t>
+        <w:t>個別の政体について検証すると、マムルーク朝（k = 0.851）は暴力的継承率63.0%で、軍事奴隷制に特有の不安定な権力移行を反映している。ローマ帝国（k = 0.880）は暴力的継承率56.4%で、3世紀の軍人皇帝時代の慢性的暴力を含む。対照的に、デンマーク（k = 1.788）は暴力的継承率8.7%、スウェーデン（k = 1.897）は13.0%であり、北欧の秩序ある継承伝統と整合的である。注目すべき例外として、スコットランド（k = 1.937だが暴力的継承率30.5%）は、暴力が存在しても時間的に均等に分散している場合にkが高くなりうることを示す。図8にkと暴力的継承率の散布図を示す。</w:t>
       </w:r>
     </w:p>
     <w:p>
@@ -4548,7 +4729,7 @@
           <w:i/>
           <w:sz w:val="20"/>
         </w:rPr>
-        <w:t>図6. 内部整合性の検証：ワイブル形状パラメータkと暴力的継承率の相関（左上）、内戦頻度との相関（右上）、安定性グループ別の暴力的継承率比較（左下）、サマリーテーブル（右下）。</w:t>
+        <w:t>図8. 内部整合性の検証：ワイブル形状パラメータkと暴力的継承率の相関（左上）、内戦頻度との相関（右上）、安定性グループ別の暴力的継承率比較（左下）、サマリーテーブル（右下）。</w:t>
       </w:r>
     </w:p>
     <w:p/>
@@ -4570,7 +4751,7 @@
           <w:i w:val="0"/>
           <w:sz w:val="24"/>
         </w:rPr>
-        <w:t>幼帝・傀儡統治者の影響を評価するため、データが利用可能な29政体について即位時年齢を集計した。表4に要約統計量を示す。政体間に大きなばらつきが存在した：中央即位年齢は13.0歳（中国・清）から56.5歳（教皇庁）の範囲であり、18歳未満の即位割合は0%（USA大統領、教皇庁）から59.3%（マムルーク朝）までの範囲であった。図7にこれらの分布を示す。</w:t>
+        <w:t>幼帝・傀儡統治者の影響を評価するため、データが利用可能な29政体について即位時年齢を集計した。表4に要約統計量を示す。政体間に大きなばらつきが存在した：中央即位年齢は13.0歳（中国・清）から56.5歳（教皇庁）の範囲であり、18歳未満の即位割合は0%（USA大統領、教皇庁）から59.3%（マムルーク朝）までの範囲であった。図9にこれらの分布を示す。</w:t>
       </w:r>
     </w:p>
     <w:p>
@@ -5700,7 +5881,7 @@
           <w:i/>
           <w:sz w:val="20"/>
         </w:rPr>
-        <w:t>図7. 即位時年齢の分布分析。(A) 政体別の即位年齢箱ひげ図。(B) kと中央即位年齢の散布図。(C) kと18歳未満即位率の散布図。(D) 政体別の年齢カテゴリ構成。</w:t>
+        <w:t>図9. 即位時年齢の分布分析。(A) 政体別の即位年齢箱ひげ図。(B) kと中央即位年齢の散布図。(C) kと18歳未満即位率の散布図。(D) 政体別の年齢カテゴリ構成。</w:t>
       </w:r>
     </w:p>
     <w:p/>
@@ -5722,7 +5903,7 @@
           <w:i w:val="0"/>
           <w:sz w:val="24"/>
         </w:rPr>
-        <w:t>幼帝がワイブル形状パラメータに与える影響を定量化するため、即位時年齢が10歳未満（一次分析）および18歳未満（二次分析）の統治者を除外してワイブル分布を再当てはめた。表5に主要な影響を受けた政体の結果を、図8に感度分析の結果を示す。</w:t>
+        <w:t>幼帝がワイブル形状パラメータに与える影響を定量化するため、即位時年齢が10歳未満（一次分析）および18歳未満（二次分析）の統治者を除外してワイブル分布を再当てはめた。表5に主要な影響を受けた政体の結果を、図10に感度分析の結果を示す。</w:t>
       </w:r>
     </w:p>
     <w:p>
@@ -7043,7 +7224,7 @@
           <w:i/>
           <w:sz w:val="20"/>
         </w:rPr>
-        <w:t>図8. 幼帝除外の感度分析。(A) 全統治者のk vs 10歳未満除外後のk（破線＝変化なし）。(B) 全統治者のk vs 18歳未満除外後のk。(C) 主要政体のkの変化（delta k）：青＝10歳未満除外、橙＝18歳未満除外。負のdeltaは幼帝がkを押し上げていたことを示す。</w:t>
+        <w:t>図10. 幼帝除外の感度分析。(A) 全統治者のk vs 10歳未満除外後のk（破線＝変化なし）。(B) 全統治者のk vs 18歳未満除外後のk。(C) 主要政体のkの変化（delta k）：青＝10歳未満除外、橙＝18歳未満除外。負のdeltaは幼帝がkを押し上げていたことを示す。</w:t>
       </w:r>
     </w:p>
     <w:p/>
@@ -7068,7 +7249,7 @@
         <w:rPr>
           <w:sz w:val="22"/>
         </w:rPr>
-        <w:t>図12にワイブル形状パラメータkのサンプルサイズと信頼区間幅の関係を示す。予想通り、信頼区間幅は概ね1/sqrt(N)に比例して減少し、最小サンプルの4政体（N &lt; 15）は信頼区間幅が1.0を超える。31政体中14政体の95%信頼区間がk = 1を跨ぐ：Aztec Empire、China (Qing)、Inca Empire、Mughal Empire、China (Tang)、Persia/Iran、Russia、Ethiopia、Mamluk Sultanate、Egypt (New Kingdom)、Holy Roman Empire、Islamic Caliphate、Roman Empire、Byzantine Empire。これらの政体については、定性的な体制分類（クーデター多発型 vs 安定型）は慎重に解釈すべきであり、データは無記憶（指数的）過程との区別に不十分である。</w:t>
+        <w:t>図11にワイブル形状パラメータkのサンプルサイズと信頼区間幅の関係を示す。予想通り、信頼区間幅は概ね1/sqrt(N)に比例して減少し、最小サンプルの4政体（N &lt; 15）は信頼区間幅が1.0を超える。31政体中14政体の95%信頼区間がk = 1を跨ぐ：Aztec Empire、China (Qing)、Inca Empire、Mughal Empire、China (Tang)、Persia/Iran、Russia、Ethiopia、Mamluk Sultanate、Egypt (New Kingdom)、Holy Roman Empire、Islamic Caliphate、Roman Empire、Byzantine Empire。これらの政体については、定性的な体制分類（クーデター多発型 vs 安定型）は慎重に解釈すべきであり、データは無記憶（指数的）過程との区別に不十分である。</w:t>
       </w:r>
     </w:p>
     <w:p>
@@ -7116,7 +7297,7 @@
           <w:i/>
           <w:sz w:val="22"/>
         </w:rPr>
-        <w:t>図12. サンプルサイズ評価。(A) 全31政体のN vs 95%信頼区間幅（赤＝CIがk=1を跨ぐ、青＝跨がない）。N = 15の垂直破線は定性的解釈の最小閾値。(B) 政体別95%信頼区間のフォレストプロット。</w:t>
+        <w:t>図11. サンプルサイズ評価。(A) 全31政体のN vs 95%信頼区間幅（赤＝CIがk=1を跨ぐ、青＝跨がない）。N = 15の垂直破線は定性的解釈の最小閾値。(B) 政体別95%信頼区間のフォレストプロット。</w:t>
       </w:r>
     </w:p>
     <w:p>
@@ -7133,21 +7314,56 @@
     <w:p>
       <w:r>
         <w:rPr>
-          <w:b w:val="0"/>
-          <w:i w:val="0"/>
           <w:sz w:val="24"/>
         </w:rPr>
-        <w:t>本研究はSaleh（2019）の先駆的な単一政体研究を6大陸31政体に拡張した、統治者在位期間に対するワイブル信頼性分析の初の系統的グローバル応用である。ワイブル分布が多様な政治システムと歴史的時代にわたって頑健な当てはまりを提供し、形状パラメータkが政治安定性パターンの意味のある変動を捉えることが示された。</w:t>
+        <w:t>本研究はSaleh</w:t>
+      </w:r>
+      <w:r>
+        <w:rPr>
+          <w:sz w:val="24"/>
+          <w:vertAlign w:val="superscript"/>
+        </w:rPr>
+        <w:t>1</w:t>
+      </w:r>
+      <w:r>
+        <w:rPr>
+          <w:sz w:val="24"/>
+        </w:rPr>
+        <w:t>の先駆的な単一政体研究を6大陸31政体に拡張した、統治者在位期間に対するワイブル信頼性分析の初の系統的グローバル応用である。ワイブル分布が多様な政治システムと歴史的時代にわたって頑健な当てはまりを提供し、形状パラメータkが政治安定性パターンの意味のある変動を捉えることが示された。</w:t>
       </w:r>
     </w:p>
     <w:p>
       <w:r>
         <w:rPr>
-          <w:b w:val="0"/>
-          <w:i w:val="0"/>
           <w:sz w:val="24"/>
         </w:rPr>
-        <w:t>本分析の基盤となる概念的枠組みは二つの知的伝統に拠る。第一は信頼性工学であり、Weibull（1951）以来ワイブル分布が部品故障時間のモデリングの標準ツールとなっている。第二は憲法理論、特に美濃部達吉の天皇機関説であり、主権者を国家装置の機能的器官として概念化した（美濃部, 1912, 1923）。この「統治者＝構成要素」の視点が信頼性工学と政治史の間の理論的橋梁を提供する：軸受やトランジスタが機械の中で定められた機能を果たし予測可能なメカニズムで最終的に故障するように、統治者は定められた憲法的役割を果たし特徴的な統計的パターンに従って最終的に退位する。</w:t>
+        <w:t>本分析の基盤となる概念的枠組みは二つの知的伝統に拠る。第一は信頼性工学であり、Weibull</w:t>
+      </w:r>
+      <w:r>
+        <w:rPr>
+          <w:sz w:val="24"/>
+          <w:vertAlign w:val="superscript"/>
+        </w:rPr>
+        <w:t>3</w:t>
+      </w:r>
+      <w:r>
+        <w:rPr>
+          <w:sz w:val="24"/>
+        </w:rPr>
+        <w:t>以来ワイブル分布が部品故障時間のモデリングの標準ツールとなっている。第二は憲法理論、特に美濃部達吉の天皇機関説であり、主権者を国家装置の機能的器官として概念化した</w:t>
+      </w:r>
+      <w:r>
+        <w:rPr>
+          <w:sz w:val="24"/>
+          <w:vertAlign w:val="superscript"/>
+        </w:rPr>
+        <w:t>6,7</w:t>
+      </w:r>
+      <w:r>
+        <w:rPr>
+          <w:sz w:val="24"/>
+        </w:rPr>
+        <w:t>。この「統治者＝構成要素」の視点が信頼性工学と政治史の間の理論的橋梁を提供する：軸受やトランジスタが機械の中で定められた機能を果たし予測可能なメカニズムで最終的に故障するように、統治者は定められた憲法的役割を果たし特徴的な統計的パターンに従って最終的に退位する。</w:t>
       </w:r>
     </w:p>
     <w:p>
@@ -7183,11 +7399,22 @@
     <w:p>
       <w:r>
         <w:rPr>
-          <w:b w:val="0"/>
-          <w:i w:val="0"/>
           <w:sz w:val="24"/>
         </w:rPr>
-        <w:t>継承メカニズム別のサブ解析は選挙制と世襲制の間の基本的な構造的差異を明らかにする。選挙制のプールk ≈ 1は、在位期間の近似的に無記憶（指数的）な分布を意味する——任意の年に継承が起こる確率が統治者の在位年数にかかわらずほぼ一定である。世襲制のより高いk（= 1.298）は生物学的老化の影響と、在位初期を生き延びた君主の「生存者利得」を反映している（Svolik, 2012）。 アメリカ合衆国大統領（k = 2.721）はデータセット中で独自の位置を占める。憲法上の任期制限（当初は事実上、1951年の修正第22条で正式化）が在位期間を機械的に制約し、有機的な政治的ダイナミクスではなく制度設計によりkを押し上げている。このため、アメリカ合衆国大統領は表1に比較目的で報告するが、プール選挙制分析からは除外し、「任期制限付き民主制」として別カテゴリで扱う。</w:t>
+        <w:t>継承メカニズム別のサブ解析は選挙制と世襲制の間の基本的な構造的差異を明らかにする。選挙制のプールk ≈ 1は、在位期間の近似的に無記憶（指数的）な分布を意味する——任意の年に継承が起こる確率が統治者の在位年数にかかわらずほぼ一定である。世襲制のより高いk（= 1.298）は生物学的老化の影響と、在位初期を生き延びた君主の「生存者利得」を反映している</w:t>
+      </w:r>
+      <w:r>
+        <w:rPr>
+          <w:sz w:val="24"/>
+          <w:vertAlign w:val="superscript"/>
+        </w:rPr>
+        <w:t>21</w:t>
+      </w:r>
+      <w:r>
+        <w:rPr>
+          <w:sz w:val="24"/>
+        </w:rPr>
+        <w:t>。 アメリカ合衆国大統領（k = 2.721）はデータセット中で独自の位置を占める。憲法上の任期制限（当初は事実上、1951年の修正第22条で正式化）が在位期間を機械的に制約し、有機的な政治的ダイナミクスではなく制度設計によりkを押し上げている。このため、アメリカ合衆国大統領は表1に比較目的で報告するが、プール選挙制分析からは除外し、「任期制限付き民主制」として別カテゴリで扱う。</w:t>
       </w:r>
     </w:p>
     <w:p>
@@ -7203,7 +7430,20 @@
         <w:rPr>
           <w:sz w:val="22"/>
         </w:rPr>
-        <w:t>ローマ帝国に関する本研究の結果は、Saleh（2019）の先駆的研究との比較に値する。Salehはローマ帝国の在位期間に2つのワイブル分布の混合を当てはめ、初期の暗殺リスクと後期の摩耗を反映するバスタブ型ハザード関数を得た。本研究の単一ワイブル当てはめ（k = 0.880）はローマ帝国の全般的なクーデター多発的性格を捉えるが、二峰性ハザード構造を解像しない。これに対処するため、ローマデータに独自の混合ワイブルを当てはめた：混合モデル（k1 = 1.464、k2 = 1.788、混合割合π = 0.566）はAIC = 327.7を達成し、単一モデルのAIC = 332.8を上回る一方、BICは単一モデルを支持する（336.8 vs 337.8）。主要な方法論的差異は、Salehが暴力的死亡までの時間を特異的に分析したのに対し、本研究は終了原因にかかわらず総在位期間を分析している点にある。文化横断的比較（本研究の主目的）には、単一の形状パラメータkが簡潔で普遍的に適用可能な要約を提供する。図11に単一・混合当てはめの比較を示す。</w:t>
+        <w:t>ローマ帝国に関する本研究の結果は、Saleh</w:t>
+      </w:r>
+      <w:r>
+        <w:rPr>
+          <w:sz w:val="22"/>
+          <w:vertAlign w:val="superscript"/>
+        </w:rPr>
+        <w:t>1</w:t>
+      </w:r>
+      <w:r>
+        <w:rPr>
+          <w:sz w:val="22"/>
+        </w:rPr>
+        <w:t>の先駆的研究との比較に値する。Salehはローマ帝国の在位期間に2つのワイブル分布の混合を当てはめ、初期の暗殺リスクと後期の摩耗を反映するバスタブ型ハザード関数を得た。本研究の単一ワイブル当てはめ（k = 0.880）はローマ帝国の全般的なクーデター多発的性格を捉えるが、二峰性ハザード構造を解像しない。これに対処するため、ローマデータに独自の混合ワイブルを当てはめた：混合モデル（k1 = 1.464、k2 = 1.788、混合割合π = 0.566）はAIC = 327.7を達成し、単一モデルのAIC = 332.8を上回る一方、BICは単一モデルを支持する（336.8 vs 337.8）。主要な方法論的差異は、Salehが暴力的死亡までの時間を特異的に分析したのに対し、本研究は終了原因にかかわらず総在位期間を分析している点にある。文化横断的比較（本研究の主目的）には、単一の形状パラメータkが簡潔で普遍的に適用可能な要約を提供する。図12に単一・混合当てはめの比較を示す。</w:t>
       </w:r>
     </w:p>
     <w:p>
@@ -7248,20 +7488,82 @@
     <w:p>
       <w:r>
         <w:rPr>
-          <w:i/>
           <w:sz w:val="22"/>
         </w:rPr>
-        <w:t>図11. ローマ帝国：単一 vs 混合ワイブル比較。(A) 確率密度関数。(B) ハザード関数：単一モデルは単調減少ハザード（k &lt; 1）、混合モデルはSaleh（2019）の知見と一致するバスタブ曲線を示す。</w:t>
+        <w:t>図12. ローマ帝国：単一 vs 混合ワイブル比較。(A) 確率密度関数。(B) ハザード関数：単一モデルは単調減少ハザード（k &lt; 1）、混合モデルはSaleh</w:t>
+      </w:r>
+      <w:r>
+        <w:rPr>
+          <w:sz w:val="22"/>
+          <w:vertAlign w:val="superscript"/>
+        </w:rPr>
+        <w:t>1</w:t>
+      </w:r>
+      <w:r>
+        <w:rPr>
+          <w:sz w:val="22"/>
+        </w:rPr>
+        <w:t>の知見と一致するバスタブ曲線を示す。</w:t>
       </w:r>
     </w:p>
     <w:p>
       <w:r>
         <w:rPr>
-          <w:b w:val="0"/>
-          <w:i w:val="0"/>
           <w:sz w:val="24"/>
         </w:rPr>
-        <w:t>年代別サブ解析は顕著な時間的パターンを明らかにする：古代から近代にかけてのkの単調増加と、現代における反転。増加傾向（古代k = 0.890から近代k = 1.200）は、継承に対する制度的制約の漸進的発展——ローマ帝政の無制約な暴力（Scheidel, 2017）から近世・近代の君主制の規則化された継承規範へ——を反映する可能性がある。この軌跡は、歴史的時間における政治的暴力の減少に関するより広い議論（Pinker, 2011; Goldstein, 2011）および暴力を制約する制度的枠組みの役割（North et al., 2009）と整合的である。大国の興亡（Kennedy, 1987）もまた、ある時代における覇権的安定が暴力的継承の頻度を減少させることで時間的傾向を形成した可能性がある。現代の反転（k = 0.996）は1945年以降の統治の根本的に異なる性質——民主化、脱植民地化、多くの政体における世襲制から選挙制への転換——を反映していると考えられる。</w:t>
+        <w:t>年代別サブ解析は顕著な時間的パターンを明らかにする：古代から近代にかけてのkの単調増加と、現代における反転。増加傾向（古代k = 0.890から近代k = 1.200）は、継承に対する制度的制約の漸進的発展——ローマ帝政の無制約な暴力</w:t>
+      </w:r>
+      <w:r>
+        <w:rPr>
+          <w:sz w:val="24"/>
+          <w:vertAlign w:val="superscript"/>
+        </w:rPr>
+        <w:t>22</w:t>
+      </w:r>
+      <w:r>
+        <w:rPr>
+          <w:sz w:val="24"/>
+        </w:rPr>
+        <w:t>から近世・近代の君主制の規則化された継承規範へ——を反映する可能性がある。この軌跡は、歴史的時間における政治的暴力の減少に関するより広い議論</w:t>
+      </w:r>
+      <w:r>
+        <w:rPr>
+          <w:sz w:val="24"/>
+          <w:vertAlign w:val="superscript"/>
+        </w:rPr>
+        <w:t>23,24</w:t>
+      </w:r>
+      <w:r>
+        <w:rPr>
+          <w:sz w:val="24"/>
+        </w:rPr>
+        <w:t>および暴力を制約する制度的枠組みの役割</w:t>
+      </w:r>
+      <w:r>
+        <w:rPr>
+          <w:sz w:val="24"/>
+          <w:vertAlign w:val="superscript"/>
+        </w:rPr>
+        <w:t>25</w:t>
+      </w:r>
+      <w:r>
+        <w:rPr>
+          <w:sz w:val="24"/>
+        </w:rPr>
+        <w:t>と整合的である。大国の興亡</w:t>
+      </w:r>
+      <w:r>
+        <w:rPr>
+          <w:sz w:val="24"/>
+          <w:vertAlign w:val="superscript"/>
+        </w:rPr>
+        <w:t>26</w:t>
+      </w:r>
+      <w:r>
+        <w:rPr>
+          <w:sz w:val="24"/>
+        </w:rPr>
+        <w:t>もまた、ある時代における覇権的安定が暴力的継承の頻度を減少させることで時間的傾向を形成した可能性がある。現代の反転（k = 0.996）は1945年以降の統治の根本的に異なる性質——民主化、脱植民地化、多くの政体における世襲制から選挙制への転換——を反映していると考えられる。</w:t>
       </w:r>
     </w:p>
     <w:p>
@@ -7312,7 +7614,7 @@
           <w:i w:val="0"/>
           <w:sz w:val="24"/>
         </w:rPr>
-        <w:t>第四に、即位時年齢分析（表4、図7）は、傀儡として擁立された幼年統治者が特定の政体に集中していることを明らかにする。日本の天皇は51.0%が18歳未満で即位し（中央即位年齢17.0歳）、中国の清朝は50.0%が10歳未満、スコットランドは38.1%が10歳未満であった。感度分析（表5、図8）では、幼帝の除外が双方向的影響を示した：日本（delta k = -0.440）やスコットランド（delta k = -0.668）ではkが低下し（管理された傀儡移行）、フランス（delta k = +0.595）やマムルーク朝（delta k = +0.221）ではkが上昇した（不安定の標的としての幼帝）。しかし、全政体を通じたkと即位年齢指標の相関は全て非有意（p &gt; 0.2）であり、若年即位がグローバルレベルでの体系的交絡因子ではなく政体固有の効果であることを示す。</w:t>
+        <w:t>第四に、即位時年齢分析（表4、図9）は、傀儡として擁立された幼年統治者が特定の政体に集中していることを明らかにする。日本の天皇は51.0%が18歳未満で即位し（中央即位年齢17.0歳）、中国の清朝は50.0%が10歳未満、スコットランドは38.1%が10歳未満であった。感度分析（表5、図10）では、幼帝の除外が双方向的影響を示した：日本（delta k = -0.440）やスコットランド（delta k = -0.668）ではkが低下し（管理された傀儡移行）、フランス（delta k = +0.595）やマムルーク朝（delta k = +0.221）ではkが上昇した（不安定の標的としての幼帝）。しかし、全政体を通じたkと即位年齢指標の相関は全て非有意（p &gt; 0.2）であり、若年即位がグローバルレベルでの体系的交絡因子ではなく政体固有の効果であることを示す。</w:t>
       </w:r>
     </w:p>
     <w:p>
@@ -7386,7 +7688,7 @@
         <w:rPr>
           <w:sz w:val="20"/>
         </w:rPr>
-        <w:t>Abernethy, R.B. (2004). The New Weibull Handbook (5th ed.). Robert B. Abernethy.</w:t>
+        <w:t>1. Saleh, J.H. (2019). Statistical reliability analysis for a most dangerous occupation: Roman emperor. Palgrave Communications, 5(1), 155.</w:t>
       </w:r>
     </w:p>
     <w:p>
@@ -7397,7 +7699,7 @@
         <w:rPr>
           <w:sz w:val="20"/>
         </w:rPr>
-        <w:t>Banno, J. (2001). Democracy in Pre-War Japan: Concepts of Government, 1871-1937. Routledge.</w:t>
+        <w:t>2. Lawless, J.F. (2003). Statistical Models and Methods for Lifetime Data (2nd ed.). Wiley.</w:t>
       </w:r>
     </w:p>
     <w:p>
@@ -7408,7 +7710,7 @@
         <w:rPr>
           <w:sz w:val="20"/>
         </w:rPr>
-        <w:t>Clauset, A. (2018). Trends and fluctuations in the severity of interstate wars. Science Advances, 4(2), eaao3580.</w:t>
+        <w:t>3. Weibull, W. (1951). A statistical distribution function of wide applicability. J. Appl. Mech., 18(3), 293-297.</w:t>
       </w:r>
     </w:p>
     <w:p>
@@ -7419,7 +7721,7 @@
         <w:rPr>
           <w:sz w:val="20"/>
         </w:rPr>
-        <w:t>Cox, D.R. (1972). Regression models and life-tables. Journal of the Royal Statistical Society: Series B, 34(2), 187-220.</w:t>
+        <w:t>4. Abernethy, R.B. (2004). The New Weibull Handbook (5th ed.). Robert B. Abernethy.</w:t>
       </w:r>
     </w:p>
     <w:p>
@@ -7430,7 +7732,7 @@
         <w:rPr>
           <w:sz w:val="20"/>
         </w:rPr>
-        <w:t>Davies, N. (2005). God's Playground: A History of Poland (Revised ed., Vol. 1). Oxford University Press. [ヤン・ザモイスキの格言 rex regnat et non gubernat および黄金の自由体制について.]</w:t>
+        <w:t>5. O'Connor, P.D.T. and Kleyner, A. (2012). Practical Reliability Engineering (5th ed.). Wiley.</w:t>
       </w:r>
     </w:p>
     <w:p>
@@ -7441,7 +7743,7 @@
         <w:rPr>
           <w:sz w:val="20"/>
         </w:rPr>
-        <w:t>Goemans, H.E., Gleditsch, K.S., and Chiozza, G. (2009). Introducing Archigos: A dataset of political leaders. Journal of Peace Research, 46(2), 269-283.</w:t>
+        <w:t>6. 美濃部達吉 (1912).『憲法講話』有斐閣.</w:t>
       </w:r>
     </w:p>
     <w:p>
@@ -7452,7 +7754,7 @@
         <w:rPr>
           <w:sz w:val="20"/>
         </w:rPr>
-        <w:t>Goldstein, J.S. (2011). Winning the War on War: The Decline of Armed Conflict Worldwide. Dutton.</w:t>
+        <w:t>7. 美濃部達吉 (1923).『憲法撮要』有斐閣.</w:t>
       </w:r>
     </w:p>
     <w:p>
@@ -7463,7 +7765,7 @@
         <w:rPr>
           <w:sz w:val="20"/>
         </w:rPr>
-        <w:t>Kaplan, E.L. and Meier, P. (1958). Nonparametric estimation from incomplete observations. JASA, 53(282), 457-481.</w:t>
+        <w:t>8. Miller, F.O. (1965). Minobe Tatsukichi: Interpreter of Constitutionalism in Japan. University of California Press.</w:t>
       </w:r>
     </w:p>
     <w:p>
@@ -7474,7 +7776,7 @@
         <w:rPr>
           <w:sz w:val="20"/>
         </w:rPr>
-        <w:t>Kennedy, P. (1987). The Rise and Fall of the Great Powers. Random House.</w:t>
+        <w:t>9. Banno, J. (2001). Democracy in Pre-War Japan: Concepts of Government, 1871-1937. Routledge.</w:t>
       </w:r>
     </w:p>
     <w:p>
@@ -7485,7 +7787,7 @@
         <w:rPr>
           <w:sz w:val="20"/>
         </w:rPr>
-        <w:t>Lawless, J.F. (2003). Statistical Models and Methods for Lifetime Data (2nd ed.). Wiley.</w:t>
+        <w:t>10. Taagepera, R. (1979). Size and duration of empires: Growth-decline curves, 600 B.C. to 600 A.D. Social Science History, 3(3/4), 115-138.</w:t>
       </w:r>
     </w:p>
     <w:p>
@@ -7496,7 +7798,7 @@
         <w:rPr>
           <w:sz w:val="20"/>
         </w:rPr>
-        <w:t>Miller, F.O. (1965). Minobe Tatsukichi: Interpreter of Constitutionalism in Japan. University of California Press.</w:t>
+        <w:t>11. Turchin, P. (2003). Historical Dynamics: Why States Rise and Fall. Princeton University Press.</w:t>
       </w:r>
     </w:p>
     <w:p>
@@ -7507,7 +7809,7 @@
         <w:rPr>
           <w:sz w:val="20"/>
         </w:rPr>
-        <w:t>美濃部達吉 (1912).『憲法講話』有斐閣.</w:t>
+        <w:t>12. Turchin, P. and Nefedov, S.A. (2009). Secular Cycles. Princeton University Press.</w:t>
       </w:r>
     </w:p>
     <w:p>
@@ -7518,7 +7820,7 @@
         <w:rPr>
           <w:sz w:val="20"/>
         </w:rPr>
-        <w:t>美濃部達吉 (1923).『憲法撮要』有斐閣.</w:t>
+        <w:t>13. Clauset, A. (2018). Trends and fluctuations in the severity of interstate wars. Science Advances, 4(2), eaao3580.</w:t>
       </w:r>
     </w:p>
     <w:p>
@@ -7529,7 +7831,7 @@
         <w:rPr>
           <w:sz w:val="20"/>
         </w:rPr>
-        <w:t>Murdock, G.P. (1967). Ethnographic Atlas. University of Pittsburgh Press.</w:t>
+        <w:t>14. Murdock, G.P. (1967). Ethnographic Atlas. University of Pittsburgh Press.</w:t>
       </w:r>
     </w:p>
     <w:p>
@@ -7540,7 +7842,7 @@
         <w:rPr>
           <w:sz w:val="20"/>
         </w:rPr>
-        <w:t>North, D.C., Wallis, J.J., and Weingast, B.R. (2009). Violence and Social Orders: A Conceptual Framework for Interpreting Recorded Human History. Cambridge University Press.</w:t>
+        <w:t>15. Olsson, O. and Paik, C. (2016). Long-run cultural divergence: Evidence from the Neolithic Revolution. Journal of Development Economics, 122, 197-213.</w:t>
       </w:r>
     </w:p>
     <w:p>
@@ -7551,7 +7853,7 @@
         <w:rPr>
           <w:sz w:val="20"/>
         </w:rPr>
-        <w:t>O'Connor, P.D.T. and Kleyner, A. (2012). Practical Reliability Engineering (5th ed.). Wiley.</w:t>
+        <w:t>16. Burnham, K.P. and Anderson, D.R. (2002). Model Selection and Multimodel Inference: A Practical Information-Theoretic Approach (2nd ed.). Springer.</w:t>
       </w:r>
     </w:p>
     <w:p>
@@ -7562,7 +7864,7 @@
         <w:rPr>
           <w:sz w:val="20"/>
         </w:rPr>
-        <w:t>Olsson, O. and Paik, C. (2016). Long-run cultural divergence: Evidence from the Neolithic Revolution. Journal of Development Economics, 122, 197-213.</w:t>
+        <w:t>17. Kaplan, E.L. and Meier, P. (1958). Nonparametric estimation from incomplete observations. JASA, 53(282), 457-481.</w:t>
       </w:r>
     </w:p>
     <w:p>
@@ -7573,7 +7875,7 @@
         <w:rPr>
           <w:sz w:val="20"/>
         </w:rPr>
-        <w:t>Pinker, S. (2011). The Better Angels of Our Nature. Viking.</w:t>
+        <w:t>18. Cox, D.R. (1972). Regression models and life-tables. Journal of the Royal Statistical Society: Series B, 34(2), 187-220.</w:t>
       </w:r>
     </w:p>
     <w:p>
@@ -7584,7 +7886,7 @@
         <w:rPr>
           <w:sz w:val="20"/>
         </w:rPr>
-        <w:t>Saleh, J.H. (2019). Statistical reliability analysis for a most dangerous occupation: Roman emperor. Palgrave Communications, 5(1), 155.</w:t>
+        <w:t>19. Goemans, H.E., Gleditsch, K.S., and Chiozza, G. (2009). Introducing Archigos: A dataset of political leaders. Journal of Peace Research, 46(2), 269-283.</w:t>
       </w:r>
     </w:p>
     <w:p>
@@ -7595,7 +7897,7 @@
         <w:rPr>
           <w:sz w:val="20"/>
         </w:rPr>
-        <w:t>Scheidel, W. (2017). The Great Leveler: Violence and the History of Inequality from the Stone Age to the Twenty-First Century. Princeton University Press.</w:t>
+        <w:t>20. Davies, N. (2005). God's Playground: A History of Poland (Revised ed., Vol. 1). Oxford University Press. [ヤン・ザモイスキの格言 rex regnat et non gubernat および黄金の自由体制について.]</w:t>
       </w:r>
     </w:p>
     <w:p>
@@ -7606,7 +7908,7 @@
         <w:rPr>
           <w:sz w:val="20"/>
         </w:rPr>
-        <w:t>Svolik, M.W. (2012). The Politics of Authoritarian Rule. Cambridge University Press.</w:t>
+        <w:t>21. Svolik, M.W. (2012). The Politics of Authoritarian Rule. Cambridge University Press.</w:t>
       </w:r>
     </w:p>
     <w:p>
@@ -7617,7 +7919,7 @@
         <w:rPr>
           <w:sz w:val="20"/>
         </w:rPr>
-        <w:t>Taagepera, R. (1979). Size and duration of empires: Growth-decline curves, 600 B.C. to 600 A.D. Social Science History, 3(3/4), 115-138.</w:t>
+        <w:t>22. Scheidel, W. (2017). The Great Leveler: Violence and the History of Inequality from the Stone Age to the Twenty-First Century. Princeton University Press.</w:t>
       </w:r>
     </w:p>
     <w:p>
@@ -7628,7 +7930,7 @@
         <w:rPr>
           <w:sz w:val="20"/>
         </w:rPr>
-        <w:t>Turchin, P. (2003). Historical Dynamics: Why States Rise and Fall. Princeton University Press.</w:t>
+        <w:t>23. Pinker, S. (2011). The Better Angels of Our Nature. Viking.</w:t>
       </w:r>
     </w:p>
     <w:p>
@@ -7639,7 +7941,7 @@
         <w:rPr>
           <w:sz w:val="20"/>
         </w:rPr>
-        <w:t>Turchin, P. and Nefedov, S.A. (2009). Secular Cycles. Princeton University Press.</w:t>
+        <w:t>24. Goldstein, J.S. (2011). Winning the War on War: The Decline of Armed Conflict Worldwide. Dutton.</w:t>
       </w:r>
     </w:p>
     <w:p>
@@ -7650,7 +7952,18 @@
         <w:rPr>
           <w:sz w:val="20"/>
         </w:rPr>
-        <w:t>Weibull, W. (1951). A statistical distribution function of wide applicability. J. Appl. Mech., 18(3), 293-297.</w:t>
+        <w:t>25. North, D.C., Wallis, J.J., and Weingast, B.R. (2009). Violence and Social Orders: A Conceptual Framework for Interpreting Recorded Human History. Cambridge University Press.</w:t>
+      </w:r>
+    </w:p>
+    <w:p>
+      <w:pPr>
+        <w:pStyle w:val="ListBullet"/>
+      </w:pPr>
+      <w:r>
+        <w:rPr>
+          <w:sz w:val="22"/>
+        </w:rPr>
+        <w:t>26. Kennedy, P. (1987). The Rise and Fall of the Great Powers. Random House.</w:t>
       </w:r>
     </w:p>
     <w:sectPr>

</xml_diff>

<commit_message>
Add Acknowledgements section thanking Saleh for foundational work
Co-Authored-By: Tatsuki Onishi <bougtoir@gmail.com>
</commit_message>
<xml_diff>
--- a/manuscript/hassc_manuscript_ja_v4.docx
+++ b/manuscript/hassc_manuscript_ja_v4.docx
@@ -7653,6 +7653,22 @@
         <w:pStyle w:val="Heading1"/>
       </w:pPr>
       <w:r>
+        <w:t>謝辞</w:t>
+      </w:r>
+    </w:p>
+    <w:p>
+      <w:r>
+        <w:rPr>
+          <w:sz w:val="22"/>
+        </w:rPr>
+        <w:t>Joseph H. Saleh氏がローマ帝国皇帝の在位期間にワイブル信頼性解析を先駆的に適用したことに感謝する。同氏の研究は本研究の概念的基盤および方法論的着想を提供した。</w:t>
+      </w:r>
+    </w:p>
+    <w:p>
+      <w:pPr>
+        <w:pStyle w:val="Heading1"/>
+      </w:pPr>
+      <w:r>
         <w:rPr>
           <w:color w:val="000000"/>
         </w:rPr>

</xml_diff>